<commit_message>
feat(data): TMDB 인기 영화 수집·적재 import_movies 커맨드
</commit_message>
<xml_diff>
--- a/docs/01_functional_spec.docx
+++ b/docs/01_functional_spec.docx
@@ -138,7 +138,7 @@
           <w:sz w:val="19"/>
           <w:szCs w:val="19"/>
         </w:rPr>
-        <w:t xml:space="preserve">로그인부터 친구 취향 비교까지 화면 01–13 및 핵심 추천 로직(별점 가중 좌표, 코사인 안전 추천, KDE 미탐색 추천)을 포함한다. 본 문서는 로컬 환경에서의 시연까지를 목표로 하며, 배포·운영 환경 요소(세션·토큰 관리, 서버 인프라, 모니터링 등)는 범위에서 제외한다.</w:t>
+        <w:t xml:space="preserve">로그인부터 친구 취향 비교까지 화면 01–13 및 핵심 추천 로직(별점 가중 좌표, 코사인 안전 추천, KDE 미탐색 추천)을 포함한다. 본 문서는 로컬 환경에서의 시연까지를 목표로 한다. 인증은 DRF 토큰 인증(dj-rest-auth)으로 로컬에서 구현하며, 운영 환경 요소(토큰 갱신·만료 정책, 서버 인프라, 모니터링 등)는 범위에서 제외한다.</w:t>
       </w:r>
     </w:p>
     <w:p>
@@ -163,7 +163,7 @@
           <w:sz w:val="19"/>
           <w:szCs w:val="19"/>
         </w:rPr>
-        <w:t xml:space="preserve">프론트엔드 Vue, 백엔드 Django REST Framework(API 서버), DB PostgreSQL. 추천·좌표 로직(임베딩·UMAP·KDE·코사인)은 Python으로 Django 측에서 수행하며, 데이터 적재·좌표 생성은 Django 관리 커맨드(manage.py)로 구성한다. 좌표 근접 검색이 필요해지면 PostgreSQL의 pgvector 확장을 활용할 수 있다.</w:t>
+        <w:t xml:space="preserve">프론트엔드 Vue, 백엔드 Django REST Framework(API 서버), DB PostgreSQL. 추천·좌표 로직(임베딩·UMAP·KDE·코사인)은 Python으로 Django 측에서 수행하며, 데이터 적재·좌표 생성은 Django 관리 커맨드(manage.py)로 구성한다. 좌표 근접 검색이 필요해지면 PostgreSQL의 pgvector 확장을 활용할 수 있다. 인증은 DRF 토큰 인증(dj-rest-auth) 기반이며, 도메인 이벤트(별점 변경 시 사용자 좌표 재계산, 친구 요청·수락 시 알림 생성)는 Django Signals로 처리한다. 사용 라이브러리 목록과 설정은 별도 기술 노트 문서(09_tech_notes)를 참조한다.</w:t>
       </w:r>
     </w:p>
     <w:p>
@@ -3056,6 +3056,98 @@
           </w:p>
         </w:tc>
       </w:tr>
+      <w:tr>
+        <w:tc>
+          <w:tcPr>
+            <w:tcW w:type="dxa" w:w="1900"/>
+            <w:tcBorders>
+              <w:top w:val="single" w:color="CCCCCC" w:sz="1"/>
+              <w:left w:val="single" w:color="CCCCCC" w:sz="1"/>
+              <w:bottom w:val="single" w:color="CCCCCC" w:sz="1"/>
+              <w:right w:val="single" w:color="CCCCCC" w:sz="1"/>
+            </w:tcBorders>
+            <w:tcMar>
+              <w:top w:type="dxa" w:w="70"/>
+              <w:left w:type="dxa" w:w="120"/>
+              <w:bottom w:type="dxa" w:w="70"/>
+              <w:right w:type="dxa" w:w="120"/>
+            </w:tcMar>
+          </w:tcPr>
+          <w:p>
+            <w:r>
+              <w:rPr>
+                <w:rFonts w:ascii="Malgun Gothic" w:cs="Malgun Gothic" w:eastAsia="Malgun Gothic" w:hAnsi="Malgun Gothic"/>
+                <w:b/>
+                <w:bCs/>
+                <w:color w:val="2F4DD0"/>
+                <w:sz w:val="18"/>
+                <w:szCs w:val="18"/>
+              </w:rPr>
+              <w:t xml:space="preserve">F-NTF-01</w:t>
+            </w:r>
+          </w:p>
+        </w:tc>
+        <w:tc>
+          <w:tcPr>
+            <w:tcW w:type="dxa" w:w="5660"/>
+            <w:tcBorders>
+              <w:top w:val="single" w:color="CCCCCC" w:sz="1"/>
+              <w:left w:val="single" w:color="CCCCCC" w:sz="1"/>
+              <w:bottom w:val="single" w:color="CCCCCC" w:sz="1"/>
+              <w:right w:val="single" w:color="CCCCCC" w:sz="1"/>
+            </w:tcBorders>
+            <w:tcMar>
+              <w:top w:type="dxa" w:w="70"/>
+              <w:left w:type="dxa" w:w="120"/>
+              <w:bottom w:type="dxa" w:w="70"/>
+              <w:right w:type="dxa" w:w="120"/>
+            </w:tcMar>
+          </w:tcPr>
+          <w:p>
+            <w:r>
+              <w:rPr>
+                <w:rFonts w:ascii="Malgun Gothic" w:cs="Malgun Gothic" w:eastAsia="Malgun Gothic" w:hAnsi="Malgun Gothic"/>
+                <w:b w:val="false"/>
+                <w:bCs w:val="false"/>
+                <w:color w:val="222222"/>
+                <w:sz w:val="18"/>
+                <w:szCs w:val="18"/>
+              </w:rPr>
+              <w:t xml:space="preserve">알림(친구 요청 받음·수락됨)</w:t>
+            </w:r>
+          </w:p>
+        </w:tc>
+        <w:tc>
+          <w:tcPr>
+            <w:tcW w:type="dxa" w:w="1800"/>
+            <w:tcBorders>
+              <w:top w:val="single" w:color="CCCCCC" w:sz="1"/>
+              <w:left w:val="single" w:color="CCCCCC" w:sz="1"/>
+              <w:bottom w:val="single" w:color="CCCCCC" w:sz="1"/>
+              <w:right w:val="single" w:color="CCCCCC" w:sz="1"/>
+            </w:tcBorders>
+            <w:tcMar>
+              <w:top w:type="dxa" w:w="70"/>
+              <w:left w:type="dxa" w:w="120"/>
+              <w:bottom w:type="dxa" w:w="70"/>
+              <w:right w:type="dxa" w:w="120"/>
+            </w:tcMar>
+          </w:tcPr>
+          <w:p>
+            <w:r>
+              <w:rPr>
+                <w:rFonts w:ascii="Malgun Gothic" w:cs="Malgun Gothic" w:eastAsia="Malgun Gothic" w:hAnsi="Malgun Gothic"/>
+                <w:b w:val="false"/>
+                <w:bCs w:val="false"/>
+                <w:color w:val="222222"/>
+                <w:sz w:val="18"/>
+                <w:szCs w:val="18"/>
+              </w:rPr>
+              <w:t xml:space="preserve">12·13</w:t>
+            </w:r>
+          </w:p>
+        </w:tc>
+      </w:tr>
     </w:tbl>
     <w:p>
       <w:r>
@@ -16905,6 +16997,616 @@
                 <w:szCs w:val="19"/>
               </w:rPr>
               <w:t xml:space="preserve">공통 데이터 부족 시 추천 품질 저하 가능</w:t>
+            </w:r>
+          </w:p>
+        </w:tc>
+      </w:tr>
+    </w:tbl>
+    <w:p>
+      <w:pPr>
+        <w:spacing w:after="60"/>
+      </w:pPr>
+    </w:p>
+    <w:p>
+      <w:pPr>
+        <w:spacing w:after="60"/>
+      </w:pPr>
+    </w:p>
+    <w:p>
+      <w:pPr>
+        <w:pStyle w:val="Heading2"/>
+      </w:pPr>
+      <w:r>
+        <w:rPr>
+          <w:rFonts w:ascii="Malgun Gothic" w:cs="Malgun Gothic" w:eastAsia="Malgun Gothic" w:hAnsi="Malgun Gothic"/>
+          <w:b/>
+          <w:bCs/>
+        </w:rPr>
+        <w:t xml:space="preserve">3.8 알림</w:t>
+      </w:r>
+    </w:p>
+    <w:p>
+      <w:pPr>
+        <w:pStyle w:val="Heading3"/>
+        <w:spacing w:after="60" w:before="220"/>
+      </w:pPr>
+      <w:r>
+        <w:rPr>
+          <w:rFonts w:ascii="Malgun Gothic" w:cs="Malgun Gothic" w:eastAsia="Malgun Gothic" w:hAnsi="Malgun Gothic"/>
+          <w:b/>
+          <w:bCs/>
+          <w:color w:val="2F4DD0"/>
+          <w:sz w:val="22"/>
+          <w:szCs w:val="22"/>
+        </w:rPr>
+        <w:t xml:space="preserve">F-NTF-01  </w:t>
+      </w:r>
+      <w:r>
+        <w:rPr>
+          <w:rFonts w:ascii="Malgun Gothic" w:cs="Malgun Gothic" w:eastAsia="Malgun Gothic" w:hAnsi="Malgun Gothic"/>
+          <w:b/>
+          <w:bCs/>
+          <w:color w:val="222222"/>
+          <w:sz w:val="22"/>
+          <w:szCs w:val="22"/>
+        </w:rPr>
+        <w:t xml:space="preserve">알림(친구 요청 받음·수락됨)</w:t>
+      </w:r>
+    </w:p>
+    <w:p>
+      <w:pPr>
+        <w:spacing w:after="80"/>
+      </w:pPr>
+      <w:r>
+        <w:rPr>
+          <w:rFonts w:ascii="Malgun Gothic" w:cs="Malgun Gothic" w:eastAsia="Malgun Gothic" w:hAnsi="Malgun Gothic"/>
+          <w:i/>
+          <w:iCs/>
+          <w:color w:val="6B6F76"/>
+          <w:sz w:val="19"/>
+          <w:szCs w:val="19"/>
+        </w:rPr>
+        <w:t xml:space="preserve">친구 도메인 이벤트를 Django Signal로 인앱 알림으로 만든다. 실시간 push가 아니라 REST 조회 기반.</w:t>
+      </w:r>
+    </w:p>
+    <w:tbl>
+      <w:tblPr>
+        <w:tblW w:type="dxa" w:w="9360"/>
+        <w:tblBorders>
+          <w:top w:val="single" w:color="auto" w:sz="4"/>
+          <w:left w:val="single" w:color="auto" w:sz="4"/>
+          <w:bottom w:val="single" w:color="auto" w:sz="4"/>
+          <w:right w:val="single" w:color="auto" w:sz="4"/>
+          <w:insideH w:val="single" w:color="auto" w:sz="4"/>
+          <w:insideV w:val="single" w:color="auto" w:sz="4"/>
+        </w:tblBorders>
+      </w:tblPr>
+      <w:tblGrid>
+        <w:gridCol w:w="1700"/>
+        <w:gridCol w:w="7660"/>
+      </w:tblGrid>
+      <w:tr>
+        <w:tc>
+          <w:tcPr>
+            <w:tcW w:type="dxa" w:w="1700"/>
+            <w:tcBorders>
+              <w:top w:val="single" w:color="CCCCCC" w:sz="1"/>
+              <w:left w:val="single" w:color="CCCCCC" w:sz="1"/>
+              <w:bottom w:val="single" w:color="CCCCCC" w:sz="1"/>
+              <w:right w:val="single" w:color="CCCCCC" w:sz="1"/>
+            </w:tcBorders>
+            <w:shd w:fill="F4F5F8" w:val="clear"/>
+            <w:tcMar>
+              <w:top w:type="dxa" w:w="70"/>
+              <w:left w:type="dxa" w:w="120"/>
+              <w:bottom w:type="dxa" w:w="70"/>
+              <w:right w:type="dxa" w:w="120"/>
+            </w:tcMar>
+            <w:vAlign w:val="top"/>
+          </w:tcPr>
+          <w:p>
+            <w:r>
+              <w:rPr>
+                <w:rFonts w:ascii="Malgun Gothic" w:cs="Malgun Gothic" w:eastAsia="Malgun Gothic" w:hAnsi="Malgun Gothic"/>
+                <w:b/>
+                <w:bCs/>
+                <w:color w:val="222222"/>
+                <w:sz w:val="19"/>
+                <w:szCs w:val="19"/>
+              </w:rPr>
+              <w:t xml:space="preserve">연결 화면</w:t>
+            </w:r>
+          </w:p>
+        </w:tc>
+        <w:tc>
+          <w:tcPr>
+            <w:tcW w:type="dxa" w:w="7660"/>
+            <w:tcBorders>
+              <w:top w:val="single" w:color="CCCCCC" w:sz="1"/>
+              <w:left w:val="single" w:color="CCCCCC" w:sz="1"/>
+              <w:bottom w:val="single" w:color="CCCCCC" w:sz="1"/>
+              <w:right w:val="single" w:color="CCCCCC" w:sz="1"/>
+            </w:tcBorders>
+            <w:tcMar>
+              <w:top w:type="dxa" w:w="70"/>
+              <w:left w:type="dxa" w:w="120"/>
+              <w:bottom w:type="dxa" w:w="70"/>
+              <w:right w:type="dxa" w:w="120"/>
+            </w:tcMar>
+            <w:vAlign w:val="top"/>
+          </w:tcPr>
+          <w:p>
+            <w:pPr>
+              <w:spacing w:after="40"/>
+            </w:pPr>
+            <w:r>
+              <w:rPr>
+                <w:rFonts w:ascii="Malgun Gothic" w:cs="Malgun Gothic" w:eastAsia="Malgun Gothic" w:hAnsi="Malgun Gothic"/>
+                <w:color w:val="222222"/>
+                <w:sz w:val="19"/>
+                <w:szCs w:val="19"/>
+              </w:rPr>
+              <w:t xml:space="preserve">전역 헤더(알림 배지) · 친구(12) · 친구 상세(13)</w:t>
+            </w:r>
+          </w:p>
+        </w:tc>
+      </w:tr>
+      <w:tr>
+        <w:tc>
+          <w:tcPr>
+            <w:tcW w:type="dxa" w:w="1700"/>
+            <w:tcBorders>
+              <w:top w:val="single" w:color="CCCCCC" w:sz="1"/>
+              <w:left w:val="single" w:color="CCCCCC" w:sz="1"/>
+              <w:bottom w:val="single" w:color="CCCCCC" w:sz="1"/>
+              <w:right w:val="single" w:color="CCCCCC" w:sz="1"/>
+            </w:tcBorders>
+            <w:shd w:fill="F4F5F8" w:val="clear"/>
+            <w:tcMar>
+              <w:top w:type="dxa" w:w="70"/>
+              <w:left w:type="dxa" w:w="120"/>
+              <w:bottom w:type="dxa" w:w="70"/>
+              <w:right w:type="dxa" w:w="120"/>
+            </w:tcMar>
+            <w:vAlign w:val="top"/>
+          </w:tcPr>
+          <w:p>
+            <w:r>
+              <w:rPr>
+                <w:rFonts w:ascii="Malgun Gothic" w:cs="Malgun Gothic" w:eastAsia="Malgun Gothic" w:hAnsi="Malgun Gothic"/>
+                <w:b/>
+                <w:bCs/>
+                <w:color w:val="222222"/>
+                <w:sz w:val="19"/>
+                <w:szCs w:val="19"/>
+              </w:rPr>
+              <w:t xml:space="preserve">입력</w:t>
+            </w:r>
+          </w:p>
+        </w:tc>
+        <w:tc>
+          <w:tcPr>
+            <w:tcW w:type="dxa" w:w="7660"/>
+            <w:tcBorders>
+              <w:top w:val="single" w:color="CCCCCC" w:sz="1"/>
+              <w:left w:val="single" w:color="CCCCCC" w:sz="1"/>
+              <w:bottom w:val="single" w:color="CCCCCC" w:sz="1"/>
+              <w:right w:val="single" w:color="CCCCCC" w:sz="1"/>
+            </w:tcBorders>
+            <w:tcMar>
+              <w:top w:type="dxa" w:w="70"/>
+              <w:left w:type="dxa" w:w="120"/>
+              <w:bottom w:type="dxa" w:w="70"/>
+              <w:right w:type="dxa" w:w="120"/>
+            </w:tcMar>
+            <w:vAlign w:val="top"/>
+          </w:tcPr>
+          <w:p>
+            <w:pPr>
+              <w:numPr>
+                <w:ilvl w:val="0"/>
+                <w:numId w:val="2"/>
+              </w:numPr>
+              <w:spacing w:after="40"/>
+            </w:pPr>
+            <w:r>
+              <w:rPr>
+                <w:rFonts w:ascii="Malgun Gothic" w:cs="Malgun Gothic" w:eastAsia="Malgun Gothic" w:hAnsi="Malgun Gothic"/>
+                <w:color w:val="222222"/>
+                <w:sz w:val="19"/>
+                <w:szCs w:val="19"/>
+              </w:rPr>
+              <w:t xml:space="preserve">친구 요청 수신(이벤트)</w:t>
+            </w:r>
+          </w:p>
+          <w:p>
+            <w:pPr>
+              <w:numPr>
+                <w:ilvl w:val="0"/>
+                <w:numId w:val="2"/>
+              </w:numPr>
+              <w:spacing w:after="40"/>
+            </w:pPr>
+            <w:r>
+              <w:rPr>
+                <w:rFonts w:ascii="Malgun Gothic" w:cs="Malgun Gothic" w:eastAsia="Malgun Gothic" w:hAnsi="Malgun Gothic"/>
+                <w:color w:val="222222"/>
+                <w:sz w:val="19"/>
+                <w:szCs w:val="19"/>
+              </w:rPr>
+              <w:t xml:space="preserve">친구 요청 수락(이벤트)</w:t>
+            </w:r>
+          </w:p>
+          <w:p>
+            <w:pPr>
+              <w:numPr>
+                <w:ilvl w:val="0"/>
+                <w:numId w:val="2"/>
+              </w:numPr>
+              <w:spacing w:after="40"/>
+            </w:pPr>
+            <w:r>
+              <w:rPr>
+                <w:rFonts w:ascii="Malgun Gothic" w:cs="Malgun Gothic" w:eastAsia="Malgun Gothic" w:hAnsi="Malgun Gothic"/>
+                <w:color w:val="222222"/>
+                <w:sz w:val="19"/>
+                <w:szCs w:val="19"/>
+              </w:rPr>
+              <w:t xml:space="preserve">알림 목록 열람 · 개별 읽음 처리</w:t>
+            </w:r>
+          </w:p>
+        </w:tc>
+      </w:tr>
+      <w:tr>
+        <w:tc>
+          <w:tcPr>
+            <w:tcW w:type="dxa" w:w="1700"/>
+            <w:tcBorders>
+              <w:top w:val="single" w:color="CCCCCC" w:sz="1"/>
+              <w:left w:val="single" w:color="CCCCCC" w:sz="1"/>
+              <w:bottom w:val="single" w:color="CCCCCC" w:sz="1"/>
+              <w:right w:val="single" w:color="CCCCCC" w:sz="1"/>
+            </w:tcBorders>
+            <w:shd w:fill="F4F5F8" w:val="clear"/>
+            <w:tcMar>
+              <w:top w:type="dxa" w:w="70"/>
+              <w:left w:type="dxa" w:w="120"/>
+              <w:bottom w:type="dxa" w:w="70"/>
+              <w:right w:type="dxa" w:w="120"/>
+            </w:tcMar>
+            <w:vAlign w:val="top"/>
+          </w:tcPr>
+          <w:p>
+            <w:r>
+              <w:rPr>
+                <w:rFonts w:ascii="Malgun Gothic" w:cs="Malgun Gothic" w:eastAsia="Malgun Gothic" w:hAnsi="Malgun Gothic"/>
+                <w:b/>
+                <w:bCs/>
+                <w:color w:val="222222"/>
+                <w:sz w:val="19"/>
+                <w:szCs w:val="19"/>
+              </w:rPr>
+              <w:t xml:space="preserve">처리</w:t>
+            </w:r>
+          </w:p>
+        </w:tc>
+        <w:tc>
+          <w:tcPr>
+            <w:tcW w:type="dxa" w:w="7660"/>
+            <w:tcBorders>
+              <w:top w:val="single" w:color="CCCCCC" w:sz="1"/>
+              <w:left w:val="single" w:color="CCCCCC" w:sz="1"/>
+              <w:bottom w:val="single" w:color="CCCCCC" w:sz="1"/>
+              <w:right w:val="single" w:color="CCCCCC" w:sz="1"/>
+            </w:tcBorders>
+            <w:tcMar>
+              <w:top w:type="dxa" w:w="70"/>
+              <w:left w:type="dxa" w:w="120"/>
+              <w:bottom w:type="dxa" w:w="70"/>
+              <w:right w:type="dxa" w:w="120"/>
+            </w:tcMar>
+            <w:vAlign w:val="top"/>
+          </w:tcPr>
+          <w:p>
+            <w:pPr>
+              <w:numPr>
+                <w:ilvl w:val="0"/>
+                <w:numId w:val="2"/>
+              </w:numPr>
+              <w:spacing w:after="40"/>
+            </w:pPr>
+            <w:r>
+              <w:rPr>
+                <w:rFonts w:ascii="Malgun Gothic" w:cs="Malgun Gothic" w:eastAsia="Malgun Gothic" w:hAnsi="Malgun Gothic"/>
+                <w:color w:val="222222"/>
+                <w:sz w:val="19"/>
+                <w:szCs w:val="19"/>
+              </w:rPr>
+              <w:t xml:space="preserve">Friendship 생성 시 Signal로 수신자(addressee)에게 알림 생성</w:t>
+            </w:r>
+          </w:p>
+          <w:p>
+            <w:pPr>
+              <w:numPr>
+                <w:ilvl w:val="0"/>
+                <w:numId w:val="2"/>
+              </w:numPr>
+              <w:spacing w:after="40"/>
+            </w:pPr>
+            <w:r>
+              <w:rPr>
+                <w:rFonts w:ascii="Malgun Gothic" w:cs="Malgun Gothic" w:eastAsia="Malgun Gothic" w:hAnsi="Malgun Gothic"/>
+                <w:color w:val="222222"/>
+                <w:sz w:val="19"/>
+                <w:szCs w:val="19"/>
+              </w:rPr>
+              <w:t xml:space="preserve">요청 수락 시 Signal로 요청자(requester)에게 알림 생성</w:t>
+            </w:r>
+          </w:p>
+          <w:p>
+            <w:pPr>
+              <w:numPr>
+                <w:ilvl w:val="0"/>
+                <w:numId w:val="2"/>
+              </w:numPr>
+              <w:spacing w:after="40"/>
+            </w:pPr>
+            <w:r>
+              <w:rPr>
+                <w:rFonts w:ascii="Malgun Gothic" w:cs="Malgun Gothic" w:eastAsia="Malgun Gothic" w:hAnsi="Malgun Gothic"/>
+                <w:color w:val="222222"/>
+                <w:sz w:val="19"/>
+                <w:szCs w:val="19"/>
+              </w:rPr>
+              <w:t xml:space="preserve">알림은 인앱 저장(수신자 · 유형 · 관련 객체 · 읽음 여부 · 생성시각)</w:t>
+            </w:r>
+          </w:p>
+          <w:p>
+            <w:pPr>
+              <w:numPr>
+                <w:ilvl w:val="0"/>
+                <w:numId w:val="2"/>
+              </w:numPr>
+              <w:spacing w:after="40"/>
+            </w:pPr>
+            <w:r>
+              <w:rPr>
+                <w:rFonts w:ascii="Malgun Gothic" w:cs="Malgun Gothic" w:eastAsia="Malgun Gothic" w:hAnsi="Malgun Gothic"/>
+                <w:color w:val="222222"/>
+                <w:sz w:val="19"/>
+                <w:szCs w:val="19"/>
+              </w:rPr>
+              <w:t xml:space="preserve">조회는 REST(페이지 진입 시 fetch/폴링), 안 읽음 개수 배지 표시</w:t>
+            </w:r>
+          </w:p>
+          <w:p>
+            <w:pPr>
+              <w:numPr>
+                <w:ilvl w:val="0"/>
+                <w:numId w:val="2"/>
+              </w:numPr>
+              <w:spacing w:after="40"/>
+            </w:pPr>
+            <w:r>
+              <w:rPr>
+                <w:rFonts w:ascii="Malgun Gothic" w:cs="Malgun Gothic" w:eastAsia="Malgun Gothic" w:hAnsi="Malgun Gothic"/>
+                <w:color w:val="222222"/>
+                <w:sz w:val="19"/>
+                <w:szCs w:val="19"/>
+              </w:rPr>
+              <w:t xml:space="preserve">실시간 push(WebSocket · FCM) 미사용 — 로컬 시연 범위</w:t>
+            </w:r>
+          </w:p>
+        </w:tc>
+      </w:tr>
+      <w:tr>
+        <w:tc>
+          <w:tcPr>
+            <w:tcW w:type="dxa" w:w="1700"/>
+            <w:tcBorders>
+              <w:top w:val="single" w:color="CCCCCC" w:sz="1"/>
+              <w:left w:val="single" w:color="CCCCCC" w:sz="1"/>
+              <w:bottom w:val="single" w:color="CCCCCC" w:sz="1"/>
+              <w:right w:val="single" w:color="CCCCCC" w:sz="1"/>
+            </w:tcBorders>
+            <w:shd w:fill="F4F5F8" w:val="clear"/>
+            <w:tcMar>
+              <w:top w:type="dxa" w:w="70"/>
+              <w:left w:type="dxa" w:w="120"/>
+              <w:bottom w:type="dxa" w:w="70"/>
+              <w:right w:type="dxa" w:w="120"/>
+            </w:tcMar>
+            <w:vAlign w:val="top"/>
+          </w:tcPr>
+          <w:p>
+            <w:r>
+              <w:rPr>
+                <w:rFonts w:ascii="Malgun Gothic" w:cs="Malgun Gothic" w:eastAsia="Malgun Gothic" w:hAnsi="Malgun Gothic"/>
+                <w:b/>
+                <w:bCs/>
+                <w:color w:val="222222"/>
+                <w:sz w:val="19"/>
+                <w:szCs w:val="19"/>
+              </w:rPr>
+              <w:t xml:space="preserve">출력 / 결과</w:t>
+            </w:r>
+          </w:p>
+        </w:tc>
+        <w:tc>
+          <w:tcPr>
+            <w:tcW w:type="dxa" w:w="7660"/>
+            <w:tcBorders>
+              <w:top w:val="single" w:color="CCCCCC" w:sz="1"/>
+              <w:left w:val="single" w:color="CCCCCC" w:sz="1"/>
+              <w:bottom w:val="single" w:color="CCCCCC" w:sz="1"/>
+              <w:right w:val="single" w:color="CCCCCC" w:sz="1"/>
+            </w:tcBorders>
+            <w:tcMar>
+              <w:top w:type="dxa" w:w="70"/>
+              <w:left w:type="dxa" w:w="120"/>
+              <w:bottom w:type="dxa" w:w="70"/>
+              <w:right w:type="dxa" w:w="120"/>
+            </w:tcMar>
+            <w:vAlign w:val="top"/>
+          </w:tcPr>
+          <w:p>
+            <w:pPr>
+              <w:numPr>
+                <w:ilvl w:val="0"/>
+                <w:numId w:val="2"/>
+              </w:numPr>
+              <w:spacing w:after="40"/>
+            </w:pPr>
+            <w:r>
+              <w:rPr>
+                <w:rFonts w:ascii="Malgun Gothic" w:cs="Malgun Gothic" w:eastAsia="Malgun Gothic" w:hAnsi="Malgun Gothic"/>
+                <w:color w:val="222222"/>
+                <w:sz w:val="19"/>
+                <w:szCs w:val="19"/>
+              </w:rPr>
+              <w:t xml:space="preserve">헤더 안 읽음 배지 갱신</w:t>
+            </w:r>
+          </w:p>
+          <w:p>
+            <w:pPr>
+              <w:numPr>
+                <w:ilvl w:val="0"/>
+                <w:numId w:val="2"/>
+              </w:numPr>
+              <w:spacing w:after="40"/>
+            </w:pPr>
+            <w:r>
+              <w:rPr>
+                <w:rFonts w:ascii="Malgun Gothic" w:cs="Malgun Gothic" w:eastAsia="Malgun Gothic" w:hAnsi="Malgun Gothic"/>
+                <w:color w:val="222222"/>
+                <w:sz w:val="19"/>
+                <w:szCs w:val="19"/>
+              </w:rPr>
+              <w:t xml:space="preserve">알림 목록 표시(요청 받음 · 수락됨)</w:t>
+            </w:r>
+          </w:p>
+          <w:p>
+            <w:pPr>
+              <w:numPr>
+                <w:ilvl w:val="0"/>
+                <w:numId w:val="2"/>
+              </w:numPr>
+              <w:spacing w:after="40"/>
+            </w:pPr>
+            <w:r>
+              <w:rPr>
+                <w:rFonts w:ascii="Malgun Gothic" w:cs="Malgun Gothic" w:eastAsia="Malgun Gothic" w:hAnsi="Malgun Gothic"/>
+                <w:color w:val="222222"/>
+                <w:sz w:val="19"/>
+                <w:szCs w:val="19"/>
+              </w:rPr>
+              <w:t xml:space="preserve">알림 클릭 시 해당 친구 화면으로 이동</w:t>
+            </w:r>
+          </w:p>
+        </w:tc>
+      </w:tr>
+      <w:tr>
+        <w:tc>
+          <w:tcPr>
+            <w:tcW w:type="dxa" w:w="1700"/>
+            <w:tcBorders>
+              <w:top w:val="single" w:color="CCCCCC" w:sz="1"/>
+              <w:left w:val="single" w:color="CCCCCC" w:sz="1"/>
+              <w:bottom w:val="single" w:color="CCCCCC" w:sz="1"/>
+              <w:right w:val="single" w:color="CCCCCC" w:sz="1"/>
+            </w:tcBorders>
+            <w:shd w:fill="F4F5F8" w:val="clear"/>
+            <w:tcMar>
+              <w:top w:type="dxa" w:w="70"/>
+              <w:left w:type="dxa" w:w="120"/>
+              <w:bottom w:type="dxa" w:w="70"/>
+              <w:right w:type="dxa" w:w="120"/>
+            </w:tcMar>
+            <w:vAlign w:val="top"/>
+          </w:tcPr>
+          <w:p>
+            <w:r>
+              <w:rPr>
+                <w:rFonts w:ascii="Malgun Gothic" w:cs="Malgun Gothic" w:eastAsia="Malgun Gothic" w:hAnsi="Malgun Gothic"/>
+                <w:b/>
+                <w:bCs/>
+                <w:color w:val="222222"/>
+                <w:sz w:val="19"/>
+                <w:szCs w:val="19"/>
+              </w:rPr>
+              <w:t xml:space="preserve">예외 / 제약</w:t>
+            </w:r>
+          </w:p>
+        </w:tc>
+        <w:tc>
+          <w:tcPr>
+            <w:tcW w:type="dxa" w:w="7660"/>
+            <w:tcBorders>
+              <w:top w:val="single" w:color="CCCCCC" w:sz="1"/>
+              <w:left w:val="single" w:color="CCCCCC" w:sz="1"/>
+              <w:bottom w:val="single" w:color="CCCCCC" w:sz="1"/>
+              <w:right w:val="single" w:color="CCCCCC" w:sz="1"/>
+            </w:tcBorders>
+            <w:tcMar>
+              <w:top w:type="dxa" w:w="70"/>
+              <w:left w:type="dxa" w:w="120"/>
+              <w:bottom w:type="dxa" w:w="70"/>
+              <w:right w:type="dxa" w:w="120"/>
+            </w:tcMar>
+            <w:vAlign w:val="top"/>
+          </w:tcPr>
+          <w:p>
+            <w:pPr>
+              <w:numPr>
+                <w:ilvl w:val="0"/>
+                <w:numId w:val="2"/>
+              </w:numPr>
+              <w:spacing w:after="40"/>
+            </w:pPr>
+            <w:r>
+              <w:rPr>
+                <w:rFonts w:ascii="Malgun Gothic" w:cs="Malgun Gothic" w:eastAsia="Malgun Gothic" w:hAnsi="Malgun Gothic"/>
+                <w:color w:val="222222"/>
+                <w:sz w:val="19"/>
+                <w:szCs w:val="19"/>
+              </w:rPr>
+              <w:t xml:space="preserve">본인이 발생시킨 이벤트는 알림 제외</w:t>
+            </w:r>
+          </w:p>
+          <w:p>
+            <w:pPr>
+              <w:numPr>
+                <w:ilvl w:val="0"/>
+                <w:numId w:val="2"/>
+              </w:numPr>
+              <w:spacing w:after="40"/>
+            </w:pPr>
+            <w:r>
+              <w:rPr>
+                <w:rFonts w:ascii="Malgun Gothic" w:cs="Malgun Gothic" w:eastAsia="Malgun Gothic" w:hAnsi="Malgun Gothic"/>
+                <w:color w:val="222222"/>
+                <w:sz w:val="19"/>
+                <w:szCs w:val="19"/>
+              </w:rPr>
+              <w:t xml:space="preserve">동일 이벤트 중복 알림 방지</w:t>
+            </w:r>
+          </w:p>
+          <w:p>
+            <w:pPr>
+              <w:numPr>
+                <w:ilvl w:val="0"/>
+                <w:numId w:val="2"/>
+              </w:numPr>
+              <w:spacing w:after="40"/>
+            </w:pPr>
+            <w:r>
+              <w:rPr>
+                <w:rFonts w:ascii="Malgun Gothic" w:cs="Malgun Gothic" w:eastAsia="Malgun Gothic" w:hAnsi="Malgun Gothic"/>
+                <w:color w:val="222222"/>
+                <w:sz w:val="19"/>
+                <w:szCs w:val="19"/>
+              </w:rPr>
+              <w:t xml:space="preserve">읽음 처리 시 배지 수 감소</w:t>
             </w:r>
           </w:p>
         </w:tc>

</xml_diff>

<commit_message>
feat(MAP-00): 사용자 좌표 계산·캐싱 + 시그널 + seed_demo
</commit_message>
<xml_diff>
--- a/docs/01_functional_spec.docx
+++ b/docs/01_functional_spec.docx
@@ -10005,7 +10005,7 @@
           <w:sz w:val="19"/>
           <w:szCs w:val="19"/>
         </w:rPr>
-        <w:t xml:space="preserve">POC 로직 기반. 시청 영화의 전역 좌표를 별점으로 가중 평균해 사용자 위치를 만든다.</w:t>
+        <w:t xml:space="preserve">POC 로직 기반. 시청한 선호 영화의 전역 좌표를 별점으로 가중 평균해 사용자 위치를 만든다.</w:t>
       </w:r>
     </w:p>
     <w:tbl>
@@ -10246,45 +10246,45 @@
                 <w:sz w:val="19"/>
                 <w:szCs w:val="19"/>
               </w:rPr>
-              <w:t xml:space="preserve">가중치 = rating − 3.0(중립)</w:t>
-            </w:r>
-          </w:p>
-          <w:p>
-            <w:pPr>
-              <w:pStyle w:val="ListParagraph"/>
-              <w:numPr>
-                <w:ilvl w:val="0"/>
-                <w:numId w:val="2"/>
-              </w:numPr>
-              <w:spacing w:after="40"/>
-            </w:pPr>
-            <w:r>
-              <w:rPr>
-                <w:rFonts w:ascii="Malgun Gothic" w:cs="Malgun Gothic" w:eastAsia="Malgun Gothic" w:hAnsi="Malgun Gothic"/>
-                <w:color w:val="222222"/>
-                <w:sz w:val="19"/>
-                <w:szCs w:val="19"/>
-              </w:rPr>
-              <w:t xml:space="preserve">user = Σ(weight·coord) / Σweight (가중 평균)</w:t>
-            </w:r>
-          </w:p>
-          <w:p>
-            <w:pPr>
-              <w:pStyle w:val="ListParagraph"/>
-              <w:numPr>
-                <w:ilvl w:val="0"/>
-                <w:numId w:val="2"/>
-              </w:numPr>
-              <w:spacing w:after="40"/>
-            </w:pPr>
-            <w:r>
-              <w:rPr>
-                <w:rFonts w:ascii="Malgun Gothic" w:cs="Malgun Gothic" w:eastAsia="Malgun Gothic" w:hAnsi="Malgun Gothic"/>
-                <w:color w:val="222222"/>
-                <w:sz w:val="19"/>
-                <w:szCs w:val="19"/>
-              </w:rPr>
-              <w:t xml:space="preserve">가중치 합이 0에 가까우면 단순 평균으로 대체</w:t>
+              <w:t xml:space="preserve">가중치 = max(rating − 3.0, 0) — 선호(3점 초과)만 중심에 반영, 비선호(≤3)는 제외</w:t>
+            </w:r>
+          </w:p>
+          <w:p>
+            <w:pPr>
+              <w:pStyle w:val="ListParagraph"/>
+              <w:numPr>
+                <w:ilvl w:val="0"/>
+                <w:numId w:val="2"/>
+              </w:numPr>
+              <w:spacing w:after="40"/>
+            </w:pPr>
+            <w:r>
+              <w:rPr>
+                <w:rFonts w:ascii="Malgun Gothic" w:cs="Malgun Gothic" w:eastAsia="Malgun Gothic" w:hAnsi="Malgun Gothic"/>
+                <w:color w:val="222222"/>
+                <w:sz w:val="19"/>
+                <w:szCs w:val="19"/>
+              </w:rPr>
+              <w:t xml:space="preserve">user = Σ(weight·coord) / Σweight (선호 영화 별점 가중 무게중심)</w:t>
+            </w:r>
+          </w:p>
+          <w:p>
+            <w:pPr>
+              <w:pStyle w:val="ListParagraph"/>
+              <w:numPr>
+                <w:ilvl w:val="0"/>
+                <w:numId w:val="2"/>
+              </w:numPr>
+              <w:spacing w:after="40"/>
+            </w:pPr>
+            <w:r>
+              <w:rPr>
+                <w:rFonts w:ascii="Malgun Gothic" w:cs="Malgun Gothic" w:eastAsia="Malgun Gothic" w:hAnsi="Malgun Gothic"/>
+                <w:color w:val="222222"/>
+                <w:sz w:val="19"/>
+                <w:szCs w:val="19"/>
+              </w:rPr>
+              <w:t xml:space="preserve">선호 영화가 없으면(Σweight≈0) 본 영화 단순 평균으로 대체</w:t>
             </w:r>
           </w:p>
           <w:p>

</xml_diff>